<commit_message>
Add new draft documents for review: esis_Draft_Comprehensive_Formatted.docx and fense_Practice_Script.docx
</commit_message>
<xml_diff>
--- a/Thesis_Chapter1.docx
+++ b/Thesis_Chapter1.docx
@@ -29,10 +29,10 @@
     </w:p>
     <w:p>
       <w:pPr>
-        <w:pStyle w:val="Heading3"/>
+        <w:pStyle w:val="NoIndent"/>
       </w:pPr>
       <w:r>
-        <w:t>The Consumer Perspective</w:t>
+        <w:t>The motivation for this research comes from three perspectives: an observation about how Vietnamese online grocery platforms price consumer-facing goods, the author’s personal career ambitions, and the practical relevance of the findings for everyday household grocery decisions.</w:t>
       </w:r>
     </w:p>
     <w:p>
@@ -40,16 +40,16 @@
         <w:pStyle w:val="NoIndent"/>
       </w:pPr>
       <w:r>
-        <w:t xml:space="preserve">Grocery shopping in Vietnam has changed considerably over the past few years. Where consumers once relied almost entirely on wet markets and neighbourhood shops, a growing share of urban households now orders food online—scrolling through product listings, comparing prices, and checking out with a few taps (Tran et al., 2025; Bairagi et al., 2020). In this environment, one pattern stands out immediately: </w:t>
+        <w:t xml:space="preserve">First, from a consumer standpoint, grocery shopping in Vietnam has changed considerably over the past few years. Where consumers once relied almost entirely on wet markets and neighbourhood shops, a growing share of urban households now orders food online, scrolling through product listings, comparing prices, and checking out with a few taps (Tran et al., 2025; Bairagi et al., 2020). In this environment, one pattern stands out immediately: </w:t>
       </w:r>
       <w:r>
         <w:rPr>
           <w:b/>
         </w:rPr>
-        <w:t>identical grocery items routinely carry different prices</w:t>
+        <w:t>grocery items that share the same core ingredients and serve the same everyday need routinely carry different prices</w:t>
       </w:r>
       <w:r>
-        <w:t>, not only across platforms, but even within a single retailer’s own catalogue. A litre of fresh milk on Winmart’s website, for instance, can range from a budget house-brand carton at around 25,000 VND to an imported organic option at over 80,000 VND—a threefold to fivefold difference for what is, at its core, the same product type.</w:t>
+        <w:t>, not only across platforms, but even within a single retailer’s own catalogue. A litre of fresh milk on Winmart’s website, for instance, can range from a budget house-brand carton at around 25,000 VND to an imported organic option at over 80,000 VND, a threefold to fivefold difference for what is, at its core, the same product.</w:t>
       </w:r>
     </w:p>
     <w:p>
@@ -82,7 +82,7 @@
         <w:t>final price</w:t>
       </w:r>
       <w:r>
-        <w:t xml:space="preserve"> (the checkout price after promotions). These are not small differences. In some categories, promotions are so pervasive that they appear to be the default pricing regime rather than a temporary event. This raises a natural question: what determines the gap between the sticker tag and the checkout total? Which product attributes—brand name, import origin, health claims, packaging size—actually cost more at the till, and which are marked up on the shelf only to be discounted away?</w:t>
+        <w:t xml:space="preserve"> (the checkout price after promotions). These are not small differences. In some categories, promotions are so pervasive that they appear to be the default pricing regime rather than a temporary event. This raises a natural question: what determines the gap between the sticker tag and the checkout total? Which product attributes (brand name, import origin, health claims, packaging size) actually cost more at the till, and which are marked up on the shelf only to be discounted away?</w:t>
       </w:r>
     </w:p>
     <w:p>
@@ -102,18 +102,10 @@
     </w:p>
     <w:p>
       <w:pPr>
-        <w:pStyle w:val="Heading3"/>
-      </w:pPr>
-      <w:r>
-        <w:t>Career Aspirations</w:t>
-      </w:r>
-    </w:p>
-    <w:p>
-      <w:pPr>
         <w:pStyle w:val="NoIndent"/>
       </w:pPr>
       <w:r>
-        <w:t xml:space="preserve">On a personal level, this thesis represents a transition from theoretical coursework to </w:t>
+        <w:t xml:space="preserve">Second, on a personal level, this thesis represents a transition from theoretical coursework to </w:t>
       </w:r>
       <w:r>
         <w:rPr>
@@ -131,13 +123,13 @@
         <w:t>end-to-end data pipeline</w:t>
       </w:r>
       <w:r>
-        <w:t>—from automated web scraping and natural language processing to econometric modelling—that runs daily and has accumulated nearly three months of continuous price observations. This is the kind of hands-on, data-intensive work that I want to pursue after graduation.</w:t>
+        <w:t xml:space="preserve"> (from automated web scraping and natural language processing to econometric modelling) that runs daily and has accumulated nearly three months of continuous price observations. This is the kind of hands-on, data-intensive work that I want to pursue after graduation.</w:t>
       </w:r>
     </w:p>
     <w:p>
       <w:pPr/>
       <w:r>
-        <w:t>The analytical challenge at the centre of the thesis—</w:t>
+        <w:t xml:space="preserve">The analytical challenge at the centre of the thesis, </w:t>
       </w:r>
       <w:r>
         <w:rPr>
@@ -146,7 +138,7 @@
         <w:t>decomposing an observed price into its constituent attribute values</w:t>
       </w:r>
       <w:r>
-        <w:t xml:space="preserve"> (brand, origin, health claim, packaging) using regression analysis—is essentially a problem of </w:t>
+        <w:t xml:space="preserve"> (brand, origin, health claim, packaging) using regression analysis, is essentially a problem of </w:t>
       </w:r>
       <w:r>
         <w:rPr>
@@ -160,10 +152,10 @@
     </w:p>
     <w:p>
       <w:pPr>
-        <w:pStyle w:val="Heading3"/>
+        <w:pStyle w:val="NoIndent"/>
       </w:pPr>
       <w:r>
-        <w:t>Expected Relevance to Daily Grocery Decisions</w:t>
+        <w:t>Third, the analysis carries practical relevance for daily grocery decisions in three specific ways: informed spending, navigating promotions, and budget allocation.</w:t>
       </w:r>
     </w:p>
     <w:p>
@@ -186,7 +178,7 @@
         <w:t>real premiums from promotional framing</w:t>
       </w:r>
       <w:r>
-        <w:t>—for instance, knowing whether the extra cost of an imported or organic label actually reaches the till, or whether promotions effectively neutralise it.</w:t>
+        <w:t>: for instance, knowing whether the extra cost of an imported or organic label actually reaches the till, or whether promotions effectively neutralise it.</w:t>
       </w:r>
     </w:p>
     <w:p>
@@ -239,7 +231,7 @@
         <w:t>which price tier</w:t>
       </w:r>
       <w:r>
-        <w:t xml:space="preserve"> to shop in—a practical insight for household budgeting.</w:t>
+        <w:t xml:space="preserve"> to shop in, a practical insight for household budgeting.</w:t>
       </w:r>
     </w:p>
     <w:p>
@@ -366,7 +358,7 @@
         <w:t>maximum promotional variance</w:t>
       </w:r>
       <w:r>
-        <w:t xml:space="preserve">—analytically useful for observing the full range of pricing behaviour. The cross-sectional hedonic design, which averages prices over each product’s observed days, dampens short-term seasonal noise, while subcategory fixed effects absorb category-level seasonality. A </w:t>
+        <w:t xml:space="preserve">, analytically useful for observing the full range of pricing behaviour. The cross-sectional hedonic design, which averages prices over each product’s observed days, dampens short-term seasonal noise, while subcategory fixed effects absorb category-level seasonality. A </w:t>
       </w:r>
       <w:r>
         <w:rPr>
@@ -381,7 +373,7 @@
     <w:p>
       <w:pPr/>
       <w:r>
-        <w:t xml:space="preserve">Vietnam’s online grocery sector is growing rapidly—food e-commerce revenue grew by an estimated 29% in 2024 (USDA, 2025)—yet there is </w:t>
+        <w:t xml:space="preserve">Vietnam’s online grocery sector is growing rapidly: food e-commerce revenue grew by an estimated 29% in 2024 (USDA, 2025), yet there is </w:t>
       </w:r>
       <w:r>
         <w:rPr>
@@ -390,7 +382,7 @@
         <w:t>almost no empirical evidence</w:t>
       </w:r>
       <w:r>
-        <w:t xml:space="preserve"> on how product attributes translate into price premiums in this channel. The modern trade segment—supermarkets and their online extensions—increasingly dominates urban food retail, but academic research on Vietnamese food pricing has relied primarily on stated-preference surveys (Mergenthaler et al., 2009; Xuan, 2021) and single-commodity analyses (Nguyen et al., 2015). This thesis addresses that gap with a </w:t>
+        <w:t xml:space="preserve"> on how product attributes translate into price premiums in this channel. The modern trade segment (supermarkets and their online extensions) increasingly dominates urban food retail, but academic research on Vietnamese food pricing has relied primarily on stated-preference surveys (Mergenthaler et al., 2009; Xuan, 2021) and single-commodity analyses (Nguyen et al., 2015). This thesis addresses that gap with a </w:t>
       </w:r>
       <w:r>
         <w:rPr>
@@ -478,7 +470,7 @@
         <w:t>promotional discounts erode those attribute premiums differentially</w:t>
       </w:r>
       <w:r>
-        <w:t xml:space="preserve"> at checkout. The term “examine” is used deliberately: the promotional erosion analysis is </w:t>
+        <w:t xml:space="preserve"> at checkout. This erosion analysis is </w:t>
       </w:r>
       <w:r>
         <w:rPr>
@@ -487,7 +479,7 @@
         <w:t>descriptive</w:t>
       </w:r>
       <w:r>
-        <w:t xml:space="preserve"> in nature—documenting the observable relationship between attributes and prices at two stages of the pricing pipeline, rather than identifying a causal mechanism behind the retailer’s promotional decisions (cf. Ekeland, Heckman &amp; Nesheim, 2001, on the identification limits of first-stage hedonic estimates).</w:t>
+        <w:t xml:space="preserve"> rather than causal: it documents the observable relationship between attributes and prices at two stages of the pricing pipeline (sticker and checkout), without identifying the retailer’s underlying promotional decision process (cf. Ekeland, Heckman &amp; Nesheim, 2001, on the identification limits of first-stage hedonic estimates).</w:t>
       </w:r>
     </w:p>
     <w:p>
@@ -668,7 +660,7 @@
         <w:t>price tier</w:t>
       </w:r>
       <w:r>
-        <w:t xml:space="preserve"> (premium versus non-premium, defined as above or below the subcategory median price, drawing on Aaker’s (1991) perceived quality dimension). This produces five groups—Generic, Local &amp; Value, Household Giant, Niche Professional, and Prestige Leader—encoded as </w:t>
+        <w:t xml:space="preserve"> (premium versus non-premium, defined as above or below the subcategory median price, drawing on Aaker’s (1991) perceived quality dimension). Crossing these two dimensions yields a 2 x 2 grid of branded products. Adding a separate “Generic” category for items that carry no recognisable brand name (and therefore sit outside the brand-recognition axis) gives a total of five groups: Generic, Local &amp; Value, Household Giant, Niche Professional, and Prestige Leader, encoded as </w:t>
       </w:r>
       <w:r>
         <w:rPr>
@@ -743,7 +735,7 @@
         <w:t>single-retailer research design</w:t>
       </w:r>
       <w:r>
-        <w:t xml:space="preserve">, drawing all price observations from Winmart’s online platform. This design choice is deliberate: by restricting data to one retailer, all products face the same platform-level pricing strategy, promotional calendar, and supply chain logistics. This </w:t>
+        <w:t xml:space="preserve">, drawing all price observations from Winmart’s online platform. Restricting data to one retailer ensures that all products face the same platform-level pricing strategy, promotional calendar, and supply chain logistics, which </w:t>
       </w:r>
       <w:r>
         <w:rPr>
@@ -752,7 +744,7 @@
         <w:t>controls for retailer-level confounds</w:t>
       </w:r>
       <w:r>
-        <w:t xml:space="preserve"> that would complicate a multi-retailer hedonic analysis, where observed price differences might reflect retailer positioning rather than product attributes (Schipmann &amp; Qaim, 2011). The external validity implications of this design choice are discussed in Chapter 5.</w:t>
+        <w:t xml:space="preserve"> that would complicate a multi-retailer hedonic analysis, where observed price differences might reflect retailer positioning rather than product attributes (Schipmann &amp; Qaim, 2011). The external validity implications of this design are discussed in Chapter 5.</w:t>
       </w:r>
     </w:p>
     <w:p>
@@ -819,7 +811,7 @@
         <w:t>dual-price design</w:t>
       </w:r>
       <w:r>
-        <w:t xml:space="preserve">—estimating the same hedonic specification on both marked and final prices—is, to the author’s knowledge, novel in the food hedonic literature. While dual pricing (list price versus transaction price) has been studied in housing markets (Haurin et al., 2010; Knight, 2002) and automobile markets (Court, 1939), no prior food hedonic study exploits the sticker-versus-checkout price gap to measure </w:t>
+        <w:t xml:space="preserve"> (estimating the same hedonic specification on both marked and final prices) is, to the author’s knowledge, novel in the food hedonic literature. While dual pricing (list price versus transaction price) has been studied in housing markets (Haurin et al., 2010; Knight, 2002) and automobile markets (Court, 1939), no prior food hedonic study exploits the sticker-versus-checkout price gap to measure </w:t>
       </w:r>
       <w:r>
         <w:rPr>
@@ -892,7 +884,7 @@
         <w:t>Chapter 3</w:t>
       </w:r>
       <w:r>
-        <w:t xml:space="preserve"> presents the methodology—the hedonic price model, functional form and estimation strategy, dual-price design, feature extraction pipeline, and brand positioning typology—with each methodological choice justified against alternative approaches. </w:t>
+        <w:t xml:space="preserve"> presents the methodology, covering the hedonic price model, functional form and estimation strategy, dual-price design, feature extraction pipeline, and brand positioning typology, with each methodological choice justified against alternative approaches. </w:t>
       </w:r>
       <w:r>
         <w:rPr>

</xml_diff>